<commit_message>
Section 3: AI Project Life Cycle
</commit_message>
<xml_diff>
--- a/Section-3.docx
+++ b/Section-3.docx
@@ -546,7 +546,8 @@
       <w:pPr>
         <w:pStyle w:val="Heading4"/>
         <w:rPr>
-          <w:b/>
+          <w:rFonts w:ascii="Cambria Math" w:hAnsi="Cambria Math"/>
+          <w:bCs/>
         </w:rPr>
       </w:pPr>
       <w:r>
@@ -566,29 +567,32 @@
           <w:numId w:val="11"/>
         </w:numPr>
         <w:rPr>
-          <w:rFonts w:ascii="Cambria Math" w:hAnsi="Cambria Math"/>
-        </w:rPr>
-      </w:pPr>
-      <w:r>
-        <w:rPr>
-          <w:rStyle w:val="Strong"/>
-          <w:rFonts w:ascii="Cambria Math" w:hAnsi="Cambria Math"/>
-        </w:rPr>
-        <w:t>Jupyter Notebook</w:t>
-      </w:r>
-      <w:r>
-        <w:rPr>
-          <w:rFonts w:ascii="Cambria Math" w:hAnsi="Cambria Math"/>
-        </w:rPr>
-        <w:t xml:space="preserve"> → for visualization and</w:t>
-      </w:r>
-      <w:bookmarkStart w:id="0" w:name="_GoBack"/>
-      <w:bookmarkEnd w:id="0"/>
-      <w:r>
-        <w:rPr>
-          <w:rFonts w:ascii="Cambria Math" w:hAnsi="Cambria Math"/>
-        </w:rPr>
-        <w:t xml:space="preserve"> coding.</w:t>
+          <w:rStyle w:val="Strong"/>
+          <w:rFonts w:ascii="Cambria Math" w:hAnsi="Cambria Math"/>
+          <w:b w:val="0"/>
+          <w:bCs w:val="0"/>
+        </w:rPr>
+      </w:pPr>
+      <w:r>
+        <w:rPr>
+          <w:rStyle w:val="Strong"/>
+          <w:rFonts w:ascii="Cambria Math" w:hAnsi="Cambria Math"/>
+          <w:lang w:val="en-US"/>
+        </w:rPr>
+        <w:t xml:space="preserve">Anaconda </w:t>
+      </w:r>
+      <w:r>
+        <w:rPr>
+          <w:rFonts w:ascii="Cambria Math" w:hAnsi="Cambria Math"/>
+        </w:rPr>
+        <w:t>→</w:t>
+      </w:r>
+      <w:r>
+        <w:rPr>
+          <w:rFonts w:ascii="Cambria Math" w:hAnsi="Cambria Math"/>
+          <w:lang w:val="en-US"/>
+        </w:rPr>
+        <w:t xml:space="preserve"> apply the whole framework.</w:t>
       </w:r>
     </w:p>
     <w:p>
@@ -607,13 +611,13 @@
           <w:rStyle w:val="Strong"/>
           <w:rFonts w:ascii="Cambria Math" w:hAnsi="Cambria Math"/>
         </w:rPr>
-        <w:t>Pandas</w:t>
-      </w:r>
-      <w:r>
-        <w:rPr>
-          <w:rFonts w:ascii="Cambria Math" w:hAnsi="Cambria Math"/>
-        </w:rPr>
-        <w:t xml:space="preserve"> → for analyzing datasets.</w:t>
+        <w:t>Jupyter Notebook</w:t>
+      </w:r>
+      <w:r>
+        <w:rPr>
+          <w:rFonts w:ascii="Cambria Math" w:hAnsi="Cambria Math"/>
+        </w:rPr>
+        <w:t xml:space="preserve"> → for visualization and coding.</w:t>
       </w:r>
     </w:p>
     <w:p>
@@ -631,14 +635,22 @@
         <w:rPr>
           <w:rStyle w:val="Strong"/>
           <w:rFonts w:ascii="Cambria Math" w:hAnsi="Cambria Math"/>
-        </w:rPr>
-        <w:t>Matplotlib</w:t>
-      </w:r>
-      <w:r>
-        <w:rPr>
-          <w:rFonts w:ascii="Cambria Math" w:hAnsi="Cambria Math"/>
-        </w:rPr>
-        <w:t xml:space="preserve"> → for plotting data.</w:t>
+          <w:lang w:val="en-US"/>
+        </w:rPr>
+        <w:t xml:space="preserve">NumPy </w:t>
+      </w:r>
+      <w:r>
+        <w:rPr>
+          <w:rFonts w:ascii="Cambria Math" w:hAnsi="Cambria Math"/>
+        </w:rPr>
+        <w:t>→</w:t>
+      </w:r>
+      <w:r>
+        <w:rPr>
+          <w:rFonts w:ascii="Cambria Math" w:hAnsi="Cambria Math"/>
+          <w:lang w:val="en-US"/>
+        </w:rPr>
+        <w:t xml:space="preserve"> for data evaluation.</w:t>
       </w:r>
     </w:p>
     <w:p>
@@ -657,6 +669,84 @@
           <w:rStyle w:val="Strong"/>
           <w:rFonts w:ascii="Cambria Math" w:hAnsi="Cambria Math"/>
         </w:rPr>
+        <w:t>Pandas</w:t>
+      </w:r>
+      <w:r>
+        <w:rPr>
+          <w:rFonts w:ascii="Cambria Math" w:hAnsi="Cambria Math"/>
+        </w:rPr>
+        <w:t xml:space="preserve"> → for analyzing datasets.</w:t>
+      </w:r>
+    </w:p>
+    <w:p>
+      <w:pPr>
+        <w:pStyle w:val="NormalWeb"/>
+        <w:numPr>
+          <w:ilvl w:val="0"/>
+          <w:numId w:val="11"/>
+        </w:numPr>
+        <w:rPr>
+          <w:rFonts w:ascii="Cambria Math" w:hAnsi="Cambria Math"/>
+        </w:rPr>
+      </w:pPr>
+      <w:r>
+        <w:rPr>
+          <w:rStyle w:val="Strong"/>
+          <w:rFonts w:ascii="Cambria Math" w:hAnsi="Cambria Math"/>
+        </w:rPr>
+        <w:t>Matplotlib</w:t>
+      </w:r>
+      <w:r>
+        <w:rPr>
+          <w:rFonts w:ascii="Cambria Math" w:hAnsi="Cambria Math"/>
+        </w:rPr>
+        <w:t xml:space="preserve"> → for plotting data.</w:t>
+      </w:r>
+      <w:bookmarkStart w:id="0" w:name="_GoBack"/>
+      <w:bookmarkEnd w:id="0"/>
+    </w:p>
+    <w:p>
+      <w:pPr>
+        <w:pStyle w:val="NormalWeb"/>
+        <w:numPr>
+          <w:ilvl w:val="0"/>
+          <w:numId w:val="11"/>
+        </w:numPr>
+        <w:rPr>
+          <w:rFonts w:ascii="Cambria Math" w:hAnsi="Cambria Math"/>
+        </w:rPr>
+      </w:pPr>
+      <w:r>
+        <w:rPr>
+          <w:rStyle w:val="Strong"/>
+          <w:rFonts w:ascii="Cambria Math" w:hAnsi="Cambria Math"/>
+          <w:lang w:val="en-US"/>
+        </w:rPr>
+        <w:t xml:space="preserve">PyTorch </w:t>
+      </w:r>
+      <w:r>
+        <w:rPr>
+          <w:rFonts w:ascii="Cambria Math" w:hAnsi="Cambria Math"/>
+        </w:rPr>
+        <w:t>→ for training and deploying ML models.</w:t>
+      </w:r>
+    </w:p>
+    <w:p>
+      <w:pPr>
+        <w:pStyle w:val="NormalWeb"/>
+        <w:numPr>
+          <w:ilvl w:val="0"/>
+          <w:numId w:val="11"/>
+        </w:numPr>
+        <w:rPr>
+          <w:rFonts w:ascii="Cambria Math" w:hAnsi="Cambria Math"/>
+        </w:rPr>
+      </w:pPr>
+      <w:r>
+        <w:rPr>
+          <w:rStyle w:val="Strong"/>
+          <w:rFonts w:ascii="Cambria Math" w:hAnsi="Cambria Math"/>
+        </w:rPr>
         <w:t>Scikit-learn</w:t>
       </w:r>
       <w:r>
@@ -668,11 +758,963 @@
     </w:p>
     <w:p>
       <w:pPr>
-        <w:pStyle w:val="ListParagraph"/>
-        <w:jc w:val="both"/>
-        <w:rPr>
+        <w:pStyle w:val="NormalWeb"/>
+        <w:numPr>
+          <w:ilvl w:val="0"/>
+          <w:numId w:val="11"/>
+        </w:numPr>
+        <w:rPr>
+          <w:rFonts w:ascii="Cambria Math" w:hAnsi="Cambria Math"/>
+        </w:rPr>
+      </w:pPr>
+      <w:r>
+        <w:rPr>
+          <w:rStyle w:val="Strong"/>
           <w:rFonts w:ascii="Cambria Math" w:hAnsi="Cambria Math"/>
           <w:lang w:val="en-US"/>
+        </w:rPr>
+        <w:t xml:space="preserve">Tensor Flow </w:t>
+      </w:r>
+      <w:r>
+        <w:rPr>
+          <w:rFonts w:ascii="Cambria Math" w:hAnsi="Cambria Math"/>
+        </w:rPr>
+        <w:t>→ for training and deploying ML models.</w:t>
+      </w:r>
+    </w:p>
+    <w:p>
+      <w:pPr>
+        <w:pStyle w:val="Heading3"/>
+        <w:rPr>
+          <w:rFonts w:ascii="Cambria Math" w:hAnsi="Cambria Math"/>
+        </w:rPr>
+      </w:pPr>
+      <w:r>
+        <w:rPr>
+          <w:rStyle w:val="Strong"/>
+          <w:rFonts w:ascii="Cambria Math" w:hAnsi="Cambria Math"/>
+          <w:b w:val="0"/>
+          <w:bCs w:val="0"/>
+        </w:rPr>
+        <w:lastRenderedPageBreak/>
+        <w:t>Step 3: Evaluation</w:t>
+      </w:r>
+    </w:p>
+    <w:p>
+      <w:pPr>
+        <w:pStyle w:val="NormalWeb"/>
+        <w:numPr>
+          <w:ilvl w:val="0"/>
+          <w:numId w:val="13"/>
+        </w:numPr>
+        <w:rPr>
+          <w:rFonts w:ascii="Cambria Math" w:hAnsi="Cambria Math"/>
+        </w:rPr>
+      </w:pPr>
+      <w:r>
+        <w:rPr>
+          <w:rFonts w:ascii="Cambria Math" w:hAnsi="Cambria Math"/>
+        </w:rPr>
+        <w:t xml:space="preserve">Evaluation helps determine </w:t>
+      </w:r>
+      <w:r>
+        <w:rPr>
+          <w:rStyle w:val="Strong"/>
+          <w:rFonts w:ascii="Cambria Math" w:hAnsi="Cambria Math"/>
+        </w:rPr>
+        <w:t>which model to use</w:t>
+      </w:r>
+      <w:r>
+        <w:rPr>
+          <w:rFonts w:ascii="Cambria Math" w:hAnsi="Cambria Math"/>
+        </w:rPr>
+        <w:t>.</w:t>
+      </w:r>
+    </w:p>
+    <w:p>
+      <w:pPr>
+        <w:pStyle w:val="NormalWeb"/>
+        <w:numPr>
+          <w:ilvl w:val="0"/>
+          <w:numId w:val="13"/>
+        </w:numPr>
+        <w:rPr>
+          <w:rFonts w:ascii="Cambria Math" w:hAnsi="Cambria Math"/>
+        </w:rPr>
+      </w:pPr>
+      <w:r>
+        <w:rPr>
+          <w:rFonts w:ascii="Cambria Math" w:hAnsi="Cambria Math"/>
+        </w:rPr>
+        <w:t xml:space="preserve">It checks whether the model’s </w:t>
+      </w:r>
+      <w:r>
+        <w:rPr>
+          <w:rStyle w:val="Strong"/>
+          <w:rFonts w:ascii="Cambria Math" w:hAnsi="Cambria Math"/>
+        </w:rPr>
+        <w:t>accuracy is within the desired range</w:t>
+      </w:r>
+      <w:r>
+        <w:rPr>
+          <w:rFonts w:ascii="Cambria Math" w:hAnsi="Cambria Math"/>
+        </w:rPr>
+        <w:t>.</w:t>
+      </w:r>
+    </w:p>
+    <w:p>
+      <w:pPr>
+        <w:pStyle w:val="Heading3"/>
+        <w:rPr>
+          <w:rFonts w:ascii="Cambria Math" w:hAnsi="Cambria Math"/>
+        </w:rPr>
+      </w:pPr>
+      <w:r>
+        <w:rPr>
+          <w:rStyle w:val="Strong"/>
+          <w:rFonts w:ascii="Cambria Math" w:hAnsi="Cambria Math"/>
+          <w:b w:val="0"/>
+          <w:bCs w:val="0"/>
+        </w:rPr>
+        <w:t xml:space="preserve">Step 4: </w:t>
+      </w:r>
+      <w:r>
+        <w:rPr>
+          <w:rStyle w:val="Strong"/>
+          <w:rFonts w:ascii="Cambria Math" w:hAnsi="Cambria Math"/>
+          <w:b w:val="0"/>
+          <w:bCs w:val="0"/>
+        </w:rPr>
+        <w:t>Features</w:t>
+      </w:r>
+    </w:p>
+    <w:p>
+      <w:pPr>
+        <w:pStyle w:val="NormalWeb"/>
+        <w:numPr>
+          <w:ilvl w:val="0"/>
+          <w:numId w:val="14"/>
+        </w:numPr>
+        <w:rPr>
+          <w:rFonts w:ascii="Cambria Math" w:hAnsi="Cambria Math"/>
+        </w:rPr>
+      </w:pPr>
+      <w:r>
+        <w:rPr>
+          <w:rStyle w:val="Strong"/>
+          <w:rFonts w:ascii="Cambria Math" w:hAnsi="Cambria Math"/>
+        </w:rPr>
+        <w:t>Features</w:t>
+      </w:r>
+      <w:r>
+        <w:rPr>
+          <w:rFonts w:ascii="Cambria Math" w:hAnsi="Cambria Math"/>
+        </w:rPr>
+        <w:t xml:space="preserve"> = input variables used for prediction.</w:t>
+      </w:r>
+    </w:p>
+    <w:p>
+      <w:pPr>
+        <w:pStyle w:val="NormalWeb"/>
+        <w:numPr>
+          <w:ilvl w:val="1"/>
+          <w:numId w:val="14"/>
+        </w:numPr>
+        <w:rPr>
+          <w:rFonts w:ascii="Cambria Math" w:hAnsi="Cambria Math"/>
+        </w:rPr>
+      </w:pPr>
+      <w:r>
+        <w:rPr>
+          <w:rFonts w:ascii="Cambria Math" w:hAnsi="Cambria Math"/>
+        </w:rPr>
+        <w:t>Example in disease detection: ID, weight, sex, heart rate, etc.</w:t>
+      </w:r>
+    </w:p>
+    <w:p>
+      <w:pPr>
+        <w:pStyle w:val="NormalWeb"/>
+        <w:numPr>
+          <w:ilvl w:val="0"/>
+          <w:numId w:val="14"/>
+        </w:numPr>
+        <w:rPr>
+          <w:rFonts w:ascii="Cambria Math" w:hAnsi="Cambria Math"/>
+        </w:rPr>
+      </w:pPr>
+      <w:r>
+        <w:rPr>
+          <w:rStyle w:val="Strong"/>
+          <w:rFonts w:ascii="Cambria Math" w:hAnsi="Cambria Math"/>
+        </w:rPr>
+        <w:t>Types of Features</w:t>
+      </w:r>
+      <w:r>
+        <w:rPr>
+          <w:rFonts w:ascii="Cambria Math" w:hAnsi="Cambria Math"/>
+        </w:rPr>
+        <w:t>:</w:t>
+      </w:r>
+    </w:p>
+    <w:p>
+      <w:pPr>
+        <w:pStyle w:val="NormalWeb"/>
+        <w:numPr>
+          <w:ilvl w:val="1"/>
+          <w:numId w:val="14"/>
+        </w:numPr>
+        <w:rPr>
+          <w:rFonts w:ascii="Cambria Math" w:hAnsi="Cambria Math"/>
+        </w:rPr>
+      </w:pPr>
+      <w:r>
+        <w:rPr>
+          <w:rStyle w:val="Strong"/>
+          <w:rFonts w:ascii="Cambria Math" w:hAnsi="Cambria Math"/>
+        </w:rPr>
+        <w:t>Numerical</w:t>
+      </w:r>
+      <w:r>
+        <w:rPr>
+          <w:rFonts w:ascii="Cambria Math" w:hAnsi="Cambria Math"/>
+        </w:rPr>
+        <w:t xml:space="preserve"> (e.g., age, weight)</w:t>
+      </w:r>
+    </w:p>
+    <w:p>
+      <w:pPr>
+        <w:pStyle w:val="NormalWeb"/>
+        <w:numPr>
+          <w:ilvl w:val="1"/>
+          <w:numId w:val="14"/>
+        </w:numPr>
+        <w:rPr>
+          <w:rFonts w:ascii="Cambria Math" w:hAnsi="Cambria Math"/>
+        </w:rPr>
+      </w:pPr>
+      <w:r>
+        <w:rPr>
+          <w:rStyle w:val="Strong"/>
+          <w:rFonts w:ascii="Cambria Math" w:hAnsi="Cambria Math"/>
+        </w:rPr>
+        <w:t>Categorical</w:t>
+      </w:r>
+      <w:r>
+        <w:rPr>
+          <w:rFonts w:ascii="Cambria Math" w:hAnsi="Cambria Math"/>
+        </w:rPr>
+        <w:t xml:space="preserve"> (e.g., male/female, yes/no)</w:t>
+      </w:r>
+    </w:p>
+    <w:p>
+      <w:pPr>
+        <w:pStyle w:val="NormalWeb"/>
+        <w:numPr>
+          <w:ilvl w:val="0"/>
+          <w:numId w:val="14"/>
+        </w:numPr>
+        <w:rPr>
+          <w:rFonts w:ascii="Cambria Math" w:hAnsi="Cambria Math"/>
+        </w:rPr>
+      </w:pPr>
+      <w:r>
+        <w:rPr>
+          <w:rStyle w:val="Strong"/>
+          <w:rFonts w:ascii="Cambria Math" w:hAnsi="Cambria Math"/>
+        </w:rPr>
+        <w:t>Target Variable</w:t>
+      </w:r>
+      <w:r>
+        <w:rPr>
+          <w:rFonts w:ascii="Cambria Math" w:hAnsi="Cambria Math"/>
+        </w:rPr>
+        <w:t xml:space="preserve"> = the output or result (e.g., disease present or not).</w:t>
+      </w:r>
+    </w:p>
+    <w:p>
+      <w:pPr>
+        <w:pStyle w:val="NormalWeb"/>
+        <w:numPr>
+          <w:ilvl w:val="0"/>
+          <w:numId w:val="14"/>
+        </w:numPr>
+        <w:rPr>
+          <w:rFonts w:ascii="Cambria Math" w:hAnsi="Cambria Math"/>
+        </w:rPr>
+      </w:pPr>
+      <w:r>
+        <w:rPr>
+          <w:rStyle w:val="Strong"/>
+          <w:rFonts w:ascii="Cambria Math" w:hAnsi="Cambria Math"/>
+        </w:rPr>
+        <w:t>Derived Feature</w:t>
+      </w:r>
+      <w:r>
+        <w:rPr>
+          <w:rFonts w:ascii="Cambria Math" w:hAnsi="Cambria Math"/>
+        </w:rPr>
+        <w:t xml:space="preserve"> = a new feature created from the original data (e.g., BMI from height and weight).</w:t>
+      </w:r>
+    </w:p>
+    <w:p>
+      <w:pPr>
+        <w:pStyle w:val="Heading3"/>
+        <w:rPr>
+          <w:rFonts w:ascii="Cambria Math" w:hAnsi="Cambria Math"/>
+        </w:rPr>
+      </w:pPr>
+      <w:r>
+        <w:rPr>
+          <w:rStyle w:val="Strong"/>
+          <w:rFonts w:ascii="Cambria Math" w:hAnsi="Cambria Math"/>
+          <w:b w:val="0"/>
+          <w:bCs w:val="0"/>
+        </w:rPr>
+        <w:t>Step 5: Modeling</w:t>
+      </w:r>
+    </w:p>
+    <w:p>
+      <w:pPr>
+        <w:pStyle w:val="NormalWeb"/>
+        <w:rPr>
+          <w:rFonts w:ascii="Cambria Math" w:hAnsi="Cambria Math"/>
+        </w:rPr>
+      </w:pPr>
+      <w:r>
+        <w:rPr>
+          <w:rFonts w:ascii="Cambria Math" w:hAnsi="Cambria Math"/>
+        </w:rPr>
+        <w:t xml:space="preserve">Modeling has </w:t>
+      </w:r>
+      <w:r>
+        <w:rPr>
+          <w:rStyle w:val="Strong"/>
+          <w:rFonts w:ascii="Cambria Math" w:hAnsi="Cambria Math"/>
+        </w:rPr>
+        <w:t>three sub-steps</w:t>
+      </w:r>
+      <w:r>
+        <w:rPr>
+          <w:rFonts w:ascii="Cambria Math" w:hAnsi="Cambria Math"/>
+        </w:rPr>
+        <w:t>:</w:t>
+      </w:r>
+    </w:p>
+    <w:p>
+      <w:pPr>
+        <w:pStyle w:val="NormalWeb"/>
+        <w:numPr>
+          <w:ilvl w:val="0"/>
+          <w:numId w:val="15"/>
+        </w:numPr>
+        <w:rPr>
+          <w:rFonts w:ascii="Cambria Math" w:hAnsi="Cambria Math"/>
+        </w:rPr>
+      </w:pPr>
+      <w:r>
+        <w:rPr>
+          <w:rStyle w:val="Strong"/>
+          <w:rFonts w:ascii="Cambria Math" w:hAnsi="Cambria Math"/>
+        </w:rPr>
+        <w:t>Choosing and Training the Model</w:t>
+      </w:r>
+    </w:p>
+    <w:p>
+      <w:pPr>
+        <w:pStyle w:val="NormalWeb"/>
+        <w:numPr>
+          <w:ilvl w:val="1"/>
+          <w:numId w:val="15"/>
+        </w:numPr>
+        <w:rPr>
+          <w:rFonts w:ascii="Cambria Math" w:hAnsi="Cambria Math"/>
+        </w:rPr>
+      </w:pPr>
+      <w:r>
+        <w:rPr>
+          <w:rFonts w:ascii="Cambria Math" w:hAnsi="Cambria Math"/>
+        </w:rPr>
+        <w:t xml:space="preserve">Uses </w:t>
+      </w:r>
+      <w:r>
+        <w:rPr>
+          <w:rStyle w:val="Strong"/>
+          <w:rFonts w:ascii="Cambria Math" w:hAnsi="Cambria Math"/>
+        </w:rPr>
+        <w:t>training data</w:t>
+      </w:r>
+      <w:r>
+        <w:rPr>
+          <w:rFonts w:ascii="Cambria Math" w:hAnsi="Cambria Math"/>
+        </w:rPr>
+        <w:t>.</w:t>
+      </w:r>
+    </w:p>
+    <w:p>
+      <w:pPr>
+        <w:pStyle w:val="NormalWeb"/>
+        <w:numPr>
+          <w:ilvl w:val="1"/>
+          <w:numId w:val="15"/>
+        </w:numPr>
+        <w:rPr>
+          <w:rFonts w:ascii="Cambria Math" w:hAnsi="Cambria Math"/>
+        </w:rPr>
+      </w:pPr>
+      <w:r>
+        <w:rPr>
+          <w:rFonts w:ascii="Cambria Math" w:hAnsi="Cambria Math"/>
+        </w:rPr>
+        <w:t xml:space="preserve">Focus on </w:t>
+      </w:r>
+      <w:r>
+        <w:rPr>
+          <w:rStyle w:val="Strong"/>
+          <w:rFonts w:ascii="Cambria Math" w:hAnsi="Cambria Math"/>
+        </w:rPr>
+        <w:t>training accuracy</w:t>
+      </w:r>
+      <w:r>
+        <w:rPr>
+          <w:rFonts w:ascii="Cambria Math" w:hAnsi="Cambria Math"/>
+        </w:rPr>
+        <w:t xml:space="preserve"> and trade-off between </w:t>
+      </w:r>
+      <w:r>
+        <w:rPr>
+          <w:rStyle w:val="Strong"/>
+          <w:rFonts w:ascii="Cambria Math" w:hAnsi="Cambria Math"/>
+        </w:rPr>
+        <w:t>time vs accuracy</w:t>
+      </w:r>
+      <w:r>
+        <w:rPr>
+          <w:rFonts w:ascii="Cambria Math" w:hAnsi="Cambria Math"/>
+        </w:rPr>
+        <w:t>.</w:t>
+      </w:r>
+    </w:p>
+    <w:p>
+      <w:pPr>
+        <w:pStyle w:val="NormalWeb"/>
+        <w:numPr>
+          <w:ilvl w:val="0"/>
+          <w:numId w:val="15"/>
+        </w:numPr>
+        <w:rPr>
+          <w:rFonts w:ascii="Cambria Math" w:hAnsi="Cambria Math"/>
+        </w:rPr>
+      </w:pPr>
+      <w:r>
+        <w:rPr>
+          <w:rStyle w:val="Strong"/>
+          <w:rFonts w:ascii="Cambria Math" w:hAnsi="Cambria Math"/>
+        </w:rPr>
+        <w:t>Tuning the Model</w:t>
+      </w:r>
+    </w:p>
+    <w:p>
+      <w:pPr>
+        <w:pStyle w:val="NormalWeb"/>
+        <w:numPr>
+          <w:ilvl w:val="1"/>
+          <w:numId w:val="15"/>
+        </w:numPr>
+        <w:rPr>
+          <w:rFonts w:ascii="Cambria Math" w:hAnsi="Cambria Math"/>
+        </w:rPr>
+      </w:pPr>
+      <w:r>
+        <w:rPr>
+          <w:rFonts w:ascii="Cambria Math" w:hAnsi="Cambria Math"/>
+        </w:rPr>
+        <w:t xml:space="preserve">Uses </w:t>
+      </w:r>
+      <w:r>
+        <w:rPr>
+          <w:rStyle w:val="Strong"/>
+          <w:rFonts w:ascii="Cambria Math" w:hAnsi="Cambria Math"/>
+        </w:rPr>
+        <w:t>validation data</w:t>
+      </w:r>
+      <w:r>
+        <w:rPr>
+          <w:rFonts w:ascii="Cambria Math" w:hAnsi="Cambria Math"/>
+        </w:rPr>
+        <w:t>.</w:t>
+      </w:r>
+    </w:p>
+    <w:p>
+      <w:pPr>
+        <w:pStyle w:val="NormalWeb"/>
+        <w:numPr>
+          <w:ilvl w:val="1"/>
+          <w:numId w:val="15"/>
+        </w:numPr>
+        <w:rPr>
+          <w:rFonts w:ascii="Cambria Math" w:hAnsi="Cambria Math"/>
+        </w:rPr>
+      </w:pPr>
+      <w:r>
+        <w:rPr>
+          <w:rFonts w:ascii="Cambria Math" w:hAnsi="Cambria Math"/>
+        </w:rPr>
+        <w:t xml:space="preserve">Adjust </w:t>
+      </w:r>
+      <w:r>
+        <w:rPr>
+          <w:rStyle w:val="Strong"/>
+          <w:rFonts w:ascii="Cambria Math" w:hAnsi="Cambria Math"/>
+        </w:rPr>
+        <w:t>hyperparameters</w:t>
+      </w:r>
+      <w:r>
+        <w:rPr>
+          <w:rFonts w:ascii="Cambria Math" w:hAnsi="Cambria Math"/>
+        </w:rPr>
+        <w:t xml:space="preserve"> (settings chosen before training, e.g., learning rate).</w:t>
+      </w:r>
+    </w:p>
+    <w:p>
+      <w:pPr>
+        <w:pStyle w:val="NormalWeb"/>
+        <w:numPr>
+          <w:ilvl w:val="0"/>
+          <w:numId w:val="15"/>
+        </w:numPr>
+        <w:rPr>
+          <w:rFonts w:ascii="Cambria Math" w:hAnsi="Cambria Math"/>
+        </w:rPr>
+      </w:pPr>
+      <w:r>
+        <w:rPr>
+          <w:rStyle w:val="Strong"/>
+          <w:rFonts w:ascii="Cambria Math" w:hAnsi="Cambria Math"/>
+        </w:rPr>
+        <w:t>Comparing with Other Models</w:t>
+      </w:r>
+    </w:p>
+    <w:p>
+      <w:pPr>
+        <w:pStyle w:val="NormalWeb"/>
+        <w:numPr>
+          <w:ilvl w:val="1"/>
+          <w:numId w:val="15"/>
+        </w:numPr>
+        <w:rPr>
+          <w:rFonts w:ascii="Cambria Math" w:hAnsi="Cambria Math"/>
+        </w:rPr>
+      </w:pPr>
+      <w:r>
+        <w:rPr>
+          <w:rFonts w:ascii="Cambria Math" w:hAnsi="Cambria Math"/>
+        </w:rPr>
+        <w:t xml:space="preserve">Uses </w:t>
+      </w:r>
+      <w:r>
+        <w:rPr>
+          <w:rStyle w:val="Strong"/>
+          <w:rFonts w:ascii="Cambria Math" w:hAnsi="Cambria Math"/>
+        </w:rPr>
+        <w:t>test data</w:t>
+      </w:r>
+      <w:r>
+        <w:rPr>
+          <w:rFonts w:ascii="Cambria Math" w:hAnsi="Cambria Math"/>
+        </w:rPr>
+        <w:t>.</w:t>
+      </w:r>
+    </w:p>
+    <w:p>
+      <w:pPr>
+        <w:pStyle w:val="NormalWeb"/>
+        <w:numPr>
+          <w:ilvl w:val="1"/>
+          <w:numId w:val="15"/>
+        </w:numPr>
+        <w:rPr>
+          <w:rFonts w:ascii="Cambria Math" w:hAnsi="Cambria Math"/>
+        </w:rPr>
+      </w:pPr>
+      <w:r>
+        <w:rPr>
+          <w:rFonts w:ascii="Cambria Math" w:hAnsi="Cambria Math"/>
+        </w:rPr>
+        <w:t xml:space="preserve">Measures </w:t>
+      </w:r>
+      <w:r>
+        <w:rPr>
+          <w:rStyle w:val="Strong"/>
+          <w:rFonts w:ascii="Cambria Math" w:hAnsi="Cambria Math"/>
+        </w:rPr>
+        <w:t>model accuracy</w:t>
+      </w:r>
+      <w:r>
+        <w:rPr>
+          <w:rFonts w:ascii="Cambria Math" w:hAnsi="Cambria Math"/>
+        </w:rPr>
+        <w:t>.</w:t>
+      </w:r>
+    </w:p>
+    <w:p>
+      <w:pPr>
+        <w:pStyle w:val="NormalWeb"/>
+        <w:rPr>
+          <w:rFonts w:ascii="Cambria Math" w:hAnsi="Cambria Math"/>
+        </w:rPr>
+      </w:pPr>
+      <w:r>
+        <w:rPr>
+          <w:rStyle w:val="Strong"/>
+          <w:rFonts w:ascii="Cambria Math" w:hAnsi="Cambria Math"/>
+        </w:rPr>
+        <w:t>Note:</w:t>
+      </w:r>
+      <w:r>
+        <w:rPr>
+          <w:rFonts w:ascii="Cambria Math" w:hAnsi="Cambria Math"/>
+        </w:rPr>
+        <w:t xml:space="preserve"> Training, validation, and test datasets must be </w:t>
+      </w:r>
+      <w:r>
+        <w:rPr>
+          <w:rStyle w:val="Strong"/>
+          <w:rFonts w:ascii="Cambria Math" w:hAnsi="Cambria Math"/>
+        </w:rPr>
+        <w:t>independent</w:t>
+      </w:r>
+      <w:r>
+        <w:rPr>
+          <w:rFonts w:ascii="Cambria Math" w:hAnsi="Cambria Math"/>
+        </w:rPr>
+        <w:t xml:space="preserve"> of each other.</w:t>
+      </w:r>
+    </w:p>
+    <w:p>
+      <w:pPr>
+        <w:pStyle w:val="Heading4"/>
+        <w:rPr>
+          <w:rFonts w:ascii="Cambria Math" w:hAnsi="Cambria Math"/>
+        </w:rPr>
+      </w:pPr>
+      <w:r>
+        <w:rPr>
+          <w:rStyle w:val="Strong"/>
+          <w:rFonts w:ascii="Cambria Math" w:hAnsi="Cambria Math"/>
+          <w:b w:val="0"/>
+          <w:bCs w:val="0"/>
+        </w:rPr>
+        <w:t>Accuracy Concepts</w:t>
+      </w:r>
+    </w:p>
+    <w:p>
+      <w:pPr>
+        <w:pStyle w:val="NormalWeb"/>
+        <w:numPr>
+          <w:ilvl w:val="0"/>
+          <w:numId w:val="16"/>
+        </w:numPr>
+        <w:rPr>
+          <w:rFonts w:ascii="Cambria Math" w:hAnsi="Cambria Math"/>
+        </w:rPr>
+      </w:pPr>
+      <w:r>
+        <w:rPr>
+          <w:rFonts w:ascii="Cambria Math" w:hAnsi="Cambria Math"/>
+        </w:rPr>
+        <w:t xml:space="preserve">Accuracy on </w:t>
+      </w:r>
+      <w:r>
+        <w:rPr>
+          <w:rStyle w:val="Strong"/>
+          <w:rFonts w:ascii="Cambria Math" w:hAnsi="Cambria Math"/>
+        </w:rPr>
+        <w:t>validation data</w:t>
+      </w:r>
+      <w:r>
+        <w:rPr>
+          <w:rFonts w:ascii="Cambria Math" w:hAnsi="Cambria Math"/>
+        </w:rPr>
+        <w:t xml:space="preserve"> should be </w:t>
+      </w:r>
+      <w:r>
+        <w:rPr>
+          <w:rStyle w:val="Strong"/>
+          <w:rFonts w:ascii="Cambria Math" w:hAnsi="Cambria Math"/>
+        </w:rPr>
+        <w:t>slightly less</w:t>
+      </w:r>
+      <w:r>
+        <w:rPr>
+          <w:rFonts w:ascii="Cambria Math" w:hAnsi="Cambria Math"/>
+        </w:rPr>
+        <w:t xml:space="preserve"> than training accuracy.</w:t>
+      </w:r>
+    </w:p>
+    <w:p>
+      <w:pPr>
+        <w:pStyle w:val="NormalWeb"/>
+        <w:numPr>
+          <w:ilvl w:val="0"/>
+          <w:numId w:val="16"/>
+        </w:numPr>
+        <w:rPr>
+          <w:rFonts w:ascii="Cambria Math" w:hAnsi="Cambria Math"/>
+        </w:rPr>
+      </w:pPr>
+      <w:r>
+        <w:rPr>
+          <w:rStyle w:val="Strong"/>
+          <w:rFonts w:ascii="Cambria Math" w:hAnsi="Cambria Math"/>
+        </w:rPr>
+        <w:t>Overfitting</w:t>
+      </w:r>
+      <w:r>
+        <w:rPr>
+          <w:rFonts w:ascii="Cambria Math" w:hAnsi="Cambria Math"/>
+        </w:rPr>
+        <w:t>:</w:t>
+      </w:r>
+    </w:p>
+    <w:p>
+      <w:pPr>
+        <w:pStyle w:val="NormalWeb"/>
+        <w:numPr>
+          <w:ilvl w:val="1"/>
+          <w:numId w:val="16"/>
+        </w:numPr>
+        <w:rPr>
+          <w:rFonts w:ascii="Cambria Math" w:hAnsi="Cambria Math"/>
+        </w:rPr>
+      </w:pPr>
+      <w:r>
+        <w:rPr>
+          <w:rFonts w:ascii="Cambria Math" w:hAnsi="Cambria Math"/>
+        </w:rPr>
+        <w:t>Model Accuracy &gt;&gt; Training Accuracy.</w:t>
+      </w:r>
+    </w:p>
+    <w:p>
+      <w:pPr>
+        <w:pStyle w:val="NormalWeb"/>
+        <w:numPr>
+          <w:ilvl w:val="1"/>
+          <w:numId w:val="16"/>
+        </w:numPr>
+        <w:rPr>
+          <w:rFonts w:ascii="Cambria Math" w:hAnsi="Cambria Math"/>
+        </w:rPr>
+      </w:pPr>
+      <w:r>
+        <w:rPr>
+          <w:rFonts w:ascii="Cambria Math" w:hAnsi="Cambria Math"/>
+        </w:rPr>
+        <w:t>The model memorizes the data instead of learning general patterns.</w:t>
+      </w:r>
+    </w:p>
+    <w:p>
+      <w:pPr>
+        <w:pStyle w:val="NormalWeb"/>
+        <w:numPr>
+          <w:ilvl w:val="0"/>
+          <w:numId w:val="16"/>
+        </w:numPr>
+        <w:rPr>
+          <w:rFonts w:ascii="Cambria Math" w:hAnsi="Cambria Math"/>
+        </w:rPr>
+      </w:pPr>
+      <w:r>
+        <w:rPr>
+          <w:rStyle w:val="Strong"/>
+          <w:rFonts w:ascii="Cambria Math" w:hAnsi="Cambria Math"/>
+        </w:rPr>
+        <w:t>Underfitting</w:t>
+      </w:r>
+      <w:r>
+        <w:rPr>
+          <w:rFonts w:ascii="Cambria Math" w:hAnsi="Cambria Math"/>
+        </w:rPr>
+        <w:t>:</w:t>
+      </w:r>
+    </w:p>
+    <w:p>
+      <w:pPr>
+        <w:pStyle w:val="NormalWeb"/>
+        <w:numPr>
+          <w:ilvl w:val="1"/>
+          <w:numId w:val="16"/>
+        </w:numPr>
+        <w:rPr>
+          <w:rFonts w:ascii="Cambria Math" w:hAnsi="Cambria Math"/>
+        </w:rPr>
+      </w:pPr>
+      <w:r>
+        <w:rPr>
+          <w:rFonts w:ascii="Cambria Math" w:hAnsi="Cambria Math"/>
+        </w:rPr>
+        <w:t>Model Accuracy &lt;&lt; Training Accuracy.</w:t>
+      </w:r>
+    </w:p>
+    <w:p>
+      <w:pPr>
+        <w:pStyle w:val="NormalWeb"/>
+        <w:numPr>
+          <w:ilvl w:val="1"/>
+          <w:numId w:val="16"/>
+        </w:numPr>
+        <w:rPr>
+          <w:rFonts w:ascii="Cambria Math" w:hAnsi="Cambria Math"/>
+        </w:rPr>
+      </w:pPr>
+      <w:r>
+        <w:rPr>
+          <w:rFonts w:ascii="Cambria Math" w:hAnsi="Cambria Math"/>
+        </w:rPr>
+        <w:t>The model is too simple and cannot capture the data’s complexity.</w:t>
+      </w:r>
+    </w:p>
+    <w:p>
+      <w:pPr>
+        <w:pStyle w:val="Heading3"/>
+        <w:rPr>
+          <w:rFonts w:ascii="Cambria Math" w:hAnsi="Cambria Math"/>
+        </w:rPr>
+      </w:pPr>
+      <w:r>
+        <w:rPr>
+          <w:rStyle w:val="Strong"/>
+          <w:rFonts w:ascii="Cambria Math" w:hAnsi="Cambria Math"/>
+          <w:b w:val="0"/>
+          <w:bCs w:val="0"/>
+        </w:rPr>
+        <w:t>Step 6: Iteration</w:t>
+      </w:r>
+    </w:p>
+    <w:p>
+      <w:pPr>
+        <w:pStyle w:val="NormalWeb"/>
+        <w:numPr>
+          <w:ilvl w:val="0"/>
+          <w:numId w:val="17"/>
+        </w:numPr>
+        <w:rPr>
+          <w:rFonts w:ascii="Cambria Math" w:hAnsi="Cambria Math"/>
+        </w:rPr>
+      </w:pPr>
+      <w:r>
+        <w:rPr>
+          <w:rFonts w:ascii="Cambria Math" w:hAnsi="Cambria Math"/>
+        </w:rPr>
+        <w:t>Iteration involves repeating steps to:</w:t>
+      </w:r>
+    </w:p>
+    <w:p>
+      <w:pPr>
+        <w:pStyle w:val="NormalWeb"/>
+        <w:numPr>
+          <w:ilvl w:val="1"/>
+          <w:numId w:val="17"/>
+        </w:numPr>
+        <w:rPr>
+          <w:rFonts w:ascii="Cambria Math" w:hAnsi="Cambria Math"/>
+        </w:rPr>
+      </w:pPr>
+      <w:r>
+        <w:rPr>
+          <w:rStyle w:val="Strong"/>
+          <w:rFonts w:ascii="Cambria Math" w:hAnsi="Cambria Math"/>
+        </w:rPr>
+        <w:t>Increase accuracy</w:t>
+      </w:r>
+      <w:r>
+        <w:rPr>
+          <w:rFonts w:ascii="Cambria Math" w:hAnsi="Cambria Math"/>
+        </w:rPr>
+        <w:t xml:space="preserve"> OR</w:t>
+      </w:r>
+    </w:p>
+    <w:p>
+      <w:pPr>
+        <w:pStyle w:val="NormalWeb"/>
+        <w:numPr>
+          <w:ilvl w:val="1"/>
+          <w:numId w:val="17"/>
+        </w:numPr>
+        <w:rPr>
+          <w:rFonts w:ascii="Cambria Math" w:hAnsi="Cambria Math"/>
+        </w:rPr>
+      </w:pPr>
+      <w:r>
+        <w:rPr>
+          <w:rStyle w:val="Strong"/>
+          <w:rFonts w:ascii="Cambria Math" w:hAnsi="Cambria Math"/>
+        </w:rPr>
+        <w:t>Reduce computational cost</w:t>
+      </w:r>
+      <w:r>
+        <w:rPr>
+          <w:rFonts w:ascii="Cambria Math" w:hAnsi="Cambria Math"/>
+        </w:rPr>
+        <w:t>.</w:t>
+      </w:r>
+    </w:p>
+    <w:p>
+      <w:pPr>
+        <w:pStyle w:val="NormalWeb"/>
+        <w:numPr>
+          <w:ilvl w:val="0"/>
+          <w:numId w:val="17"/>
+        </w:numPr>
+        <w:rPr>
+          <w:rFonts w:ascii="Cambria Math" w:hAnsi="Cambria Math"/>
+        </w:rPr>
+      </w:pPr>
+      <w:r>
+        <w:rPr>
+          <w:rFonts w:ascii="Cambria Math" w:hAnsi="Cambria Math"/>
+        </w:rPr>
+        <w:lastRenderedPageBreak/>
+        <w:t xml:space="preserve">It is a continuous </w:t>
+      </w:r>
+      <w:r>
+        <w:rPr>
+          <w:rStyle w:val="Strong"/>
+          <w:rFonts w:ascii="Cambria Math" w:hAnsi="Cambria Math"/>
+        </w:rPr>
+        <w:t>feedback loop</w:t>
+      </w:r>
+      <w:r>
+        <w:rPr>
+          <w:rFonts w:ascii="Cambria Math" w:hAnsi="Cambria Math"/>
+        </w:rPr>
+        <w:t xml:space="preserve"> until the model improves.</w:t>
+      </w:r>
+    </w:p>
+    <w:p>
+      <w:pPr>
+        <w:pStyle w:val="NormalWeb"/>
+        <w:rPr>
+          <w:rFonts w:ascii="Cambria Math" w:hAnsi="Cambria Math"/>
+        </w:rPr>
+      </w:pPr>
+      <w:r>
+        <w:t xml:space="preserve">This framework shows how an AI project moves from </w:t>
+      </w:r>
+      <w:r>
+        <w:rPr>
+          <w:rStyle w:val="Strong"/>
+        </w:rPr>
+        <w:t>problem definition → data → evaluation → features → modeling → iteration</w:t>
+      </w:r>
+      <w:r>
+        <w:t>, leading to deployment.</w:t>
+      </w:r>
+    </w:p>
+    <w:p>
+      <w:pPr>
+        <w:pStyle w:val="NormalWeb"/>
+        <w:rPr>
+          <w:rFonts w:ascii="Cambria Math" w:hAnsi="Cambria Math"/>
         </w:rPr>
       </w:pPr>
     </w:p>
@@ -802,6 +1844,272 @@
     </w:lvl>
   </w:abstractNum>
   <w:abstractNum w:abstractNumId="1" w15:restartNumberingAfterBreak="0">
+    <w:nsid w:val="1AB13541"/>
+    <w:multiLevelType w:val="multilevel"/>
+    <w:tmpl w:val="9474A07C"/>
+    <w:lvl w:ilvl="0">
+      <w:start w:val="1"/>
+      <w:numFmt w:val="decimal"/>
+      <w:lvlText w:val="%1."/>
+      <w:lvlJc w:val="left"/>
+      <w:pPr>
+        <w:tabs>
+          <w:tab w:val="num" w:pos="720"/>
+        </w:tabs>
+        <w:ind w:left="720" w:hanging="360"/>
+      </w:pPr>
+    </w:lvl>
+    <w:lvl w:ilvl="1">
+      <w:start w:val="1"/>
+      <w:numFmt w:val="bullet"/>
+      <w:lvlText w:val="o"/>
+      <w:lvlJc w:val="left"/>
+      <w:pPr>
+        <w:tabs>
+          <w:tab w:val="num" w:pos="1440"/>
+        </w:tabs>
+        <w:ind w:left="1440" w:hanging="360"/>
+      </w:pPr>
+      <w:rPr>
+        <w:rFonts w:ascii="Courier New" w:hAnsi="Courier New" w:hint="default"/>
+        <w:sz w:val="20"/>
+      </w:rPr>
+    </w:lvl>
+    <w:lvl w:ilvl="2" w:tentative="1">
+      <w:start w:val="1"/>
+      <w:numFmt w:val="decimal"/>
+      <w:lvlText w:val="%3."/>
+      <w:lvlJc w:val="left"/>
+      <w:pPr>
+        <w:tabs>
+          <w:tab w:val="num" w:pos="2160"/>
+        </w:tabs>
+        <w:ind w:left="2160" w:hanging="360"/>
+      </w:pPr>
+    </w:lvl>
+    <w:lvl w:ilvl="3" w:tentative="1">
+      <w:start w:val="1"/>
+      <w:numFmt w:val="decimal"/>
+      <w:lvlText w:val="%4."/>
+      <w:lvlJc w:val="left"/>
+      <w:pPr>
+        <w:tabs>
+          <w:tab w:val="num" w:pos="2880"/>
+        </w:tabs>
+        <w:ind w:left="2880" w:hanging="360"/>
+      </w:pPr>
+    </w:lvl>
+    <w:lvl w:ilvl="4" w:tentative="1">
+      <w:start w:val="1"/>
+      <w:numFmt w:val="decimal"/>
+      <w:lvlText w:val="%5."/>
+      <w:lvlJc w:val="left"/>
+      <w:pPr>
+        <w:tabs>
+          <w:tab w:val="num" w:pos="3600"/>
+        </w:tabs>
+        <w:ind w:left="3600" w:hanging="360"/>
+      </w:pPr>
+    </w:lvl>
+    <w:lvl w:ilvl="5" w:tentative="1">
+      <w:start w:val="1"/>
+      <w:numFmt w:val="decimal"/>
+      <w:lvlText w:val="%6."/>
+      <w:lvlJc w:val="left"/>
+      <w:pPr>
+        <w:tabs>
+          <w:tab w:val="num" w:pos="4320"/>
+        </w:tabs>
+        <w:ind w:left="4320" w:hanging="360"/>
+      </w:pPr>
+    </w:lvl>
+    <w:lvl w:ilvl="6" w:tentative="1">
+      <w:start w:val="1"/>
+      <w:numFmt w:val="decimal"/>
+      <w:lvlText w:val="%7."/>
+      <w:lvlJc w:val="left"/>
+      <w:pPr>
+        <w:tabs>
+          <w:tab w:val="num" w:pos="5040"/>
+        </w:tabs>
+        <w:ind w:left="5040" w:hanging="360"/>
+      </w:pPr>
+    </w:lvl>
+    <w:lvl w:ilvl="7" w:tentative="1">
+      <w:start w:val="1"/>
+      <w:numFmt w:val="decimal"/>
+      <w:lvlText w:val="%8."/>
+      <w:lvlJc w:val="left"/>
+      <w:pPr>
+        <w:tabs>
+          <w:tab w:val="num" w:pos="5760"/>
+        </w:tabs>
+        <w:ind w:left="5760" w:hanging="360"/>
+      </w:pPr>
+    </w:lvl>
+    <w:lvl w:ilvl="8" w:tentative="1">
+      <w:start w:val="1"/>
+      <w:numFmt w:val="decimal"/>
+      <w:lvlText w:val="%9."/>
+      <w:lvlJc w:val="left"/>
+      <w:pPr>
+        <w:tabs>
+          <w:tab w:val="num" w:pos="6480"/>
+        </w:tabs>
+        <w:ind w:left="6480" w:hanging="360"/>
+      </w:pPr>
+    </w:lvl>
+  </w:abstractNum>
+  <w:abstractNum w:abstractNumId="2" w15:restartNumberingAfterBreak="0">
+    <w:nsid w:val="1AEE43DA"/>
+    <w:multiLevelType w:val="multilevel"/>
+    <w:tmpl w:val="98BE1CB4"/>
+    <w:lvl w:ilvl="0">
+      <w:start w:val="1"/>
+      <w:numFmt w:val="bullet"/>
+      <w:lvlText w:val=""/>
+      <w:lvlJc w:val="left"/>
+      <w:pPr>
+        <w:tabs>
+          <w:tab w:val="num" w:pos="720"/>
+        </w:tabs>
+        <w:ind w:left="720" w:hanging="360"/>
+      </w:pPr>
+      <w:rPr>
+        <w:rFonts w:ascii="Symbol" w:hAnsi="Symbol" w:hint="default"/>
+        <w:sz w:val="20"/>
+      </w:rPr>
+    </w:lvl>
+    <w:lvl w:ilvl="1">
+      <w:start w:val="1"/>
+      <w:numFmt w:val="bullet"/>
+      <w:lvlText w:val="o"/>
+      <w:lvlJc w:val="left"/>
+      <w:pPr>
+        <w:tabs>
+          <w:tab w:val="num" w:pos="1440"/>
+        </w:tabs>
+        <w:ind w:left="1440" w:hanging="360"/>
+      </w:pPr>
+      <w:rPr>
+        <w:rFonts w:ascii="Courier New" w:hAnsi="Courier New" w:hint="default"/>
+        <w:sz w:val="20"/>
+      </w:rPr>
+    </w:lvl>
+    <w:lvl w:ilvl="2" w:tentative="1">
+      <w:start w:val="1"/>
+      <w:numFmt w:val="bullet"/>
+      <w:lvlText w:val=""/>
+      <w:lvlJc w:val="left"/>
+      <w:pPr>
+        <w:tabs>
+          <w:tab w:val="num" w:pos="2160"/>
+        </w:tabs>
+        <w:ind w:left="2160" w:hanging="360"/>
+      </w:pPr>
+      <w:rPr>
+        <w:rFonts w:ascii="Wingdings" w:hAnsi="Wingdings" w:hint="default"/>
+        <w:sz w:val="20"/>
+      </w:rPr>
+    </w:lvl>
+    <w:lvl w:ilvl="3" w:tentative="1">
+      <w:start w:val="1"/>
+      <w:numFmt w:val="bullet"/>
+      <w:lvlText w:val=""/>
+      <w:lvlJc w:val="left"/>
+      <w:pPr>
+        <w:tabs>
+          <w:tab w:val="num" w:pos="2880"/>
+        </w:tabs>
+        <w:ind w:left="2880" w:hanging="360"/>
+      </w:pPr>
+      <w:rPr>
+        <w:rFonts w:ascii="Wingdings" w:hAnsi="Wingdings" w:hint="default"/>
+        <w:sz w:val="20"/>
+      </w:rPr>
+    </w:lvl>
+    <w:lvl w:ilvl="4" w:tentative="1">
+      <w:start w:val="1"/>
+      <w:numFmt w:val="bullet"/>
+      <w:lvlText w:val=""/>
+      <w:lvlJc w:val="left"/>
+      <w:pPr>
+        <w:tabs>
+          <w:tab w:val="num" w:pos="3600"/>
+        </w:tabs>
+        <w:ind w:left="3600" w:hanging="360"/>
+      </w:pPr>
+      <w:rPr>
+        <w:rFonts w:ascii="Wingdings" w:hAnsi="Wingdings" w:hint="default"/>
+        <w:sz w:val="20"/>
+      </w:rPr>
+    </w:lvl>
+    <w:lvl w:ilvl="5" w:tentative="1">
+      <w:start w:val="1"/>
+      <w:numFmt w:val="bullet"/>
+      <w:lvlText w:val=""/>
+      <w:lvlJc w:val="left"/>
+      <w:pPr>
+        <w:tabs>
+          <w:tab w:val="num" w:pos="4320"/>
+        </w:tabs>
+        <w:ind w:left="4320" w:hanging="360"/>
+      </w:pPr>
+      <w:rPr>
+        <w:rFonts w:ascii="Wingdings" w:hAnsi="Wingdings" w:hint="default"/>
+        <w:sz w:val="20"/>
+      </w:rPr>
+    </w:lvl>
+    <w:lvl w:ilvl="6" w:tentative="1">
+      <w:start w:val="1"/>
+      <w:numFmt w:val="bullet"/>
+      <w:lvlText w:val=""/>
+      <w:lvlJc w:val="left"/>
+      <w:pPr>
+        <w:tabs>
+          <w:tab w:val="num" w:pos="5040"/>
+        </w:tabs>
+        <w:ind w:left="5040" w:hanging="360"/>
+      </w:pPr>
+      <w:rPr>
+        <w:rFonts w:ascii="Wingdings" w:hAnsi="Wingdings" w:hint="default"/>
+        <w:sz w:val="20"/>
+      </w:rPr>
+    </w:lvl>
+    <w:lvl w:ilvl="7" w:tentative="1">
+      <w:start w:val="1"/>
+      <w:numFmt w:val="bullet"/>
+      <w:lvlText w:val=""/>
+      <w:lvlJc w:val="left"/>
+      <w:pPr>
+        <w:tabs>
+          <w:tab w:val="num" w:pos="5760"/>
+        </w:tabs>
+        <w:ind w:left="5760" w:hanging="360"/>
+      </w:pPr>
+      <w:rPr>
+        <w:rFonts w:ascii="Wingdings" w:hAnsi="Wingdings" w:hint="default"/>
+        <w:sz w:val="20"/>
+      </w:rPr>
+    </w:lvl>
+    <w:lvl w:ilvl="8" w:tentative="1">
+      <w:start w:val="1"/>
+      <w:numFmt w:val="bullet"/>
+      <w:lvlText w:val=""/>
+      <w:lvlJc w:val="left"/>
+      <w:pPr>
+        <w:tabs>
+          <w:tab w:val="num" w:pos="6480"/>
+        </w:tabs>
+        <w:ind w:left="6480" w:hanging="360"/>
+      </w:pPr>
+      <w:rPr>
+        <w:rFonts w:ascii="Wingdings" w:hAnsi="Wingdings" w:hint="default"/>
+        <w:sz w:val="20"/>
+      </w:rPr>
+    </w:lvl>
+  </w:abstractNum>
+  <w:abstractNum w:abstractNumId="3" w15:restartNumberingAfterBreak="0">
     <w:nsid w:val="1B3F65FF"/>
     <w:multiLevelType w:val="hybridMultilevel"/>
     <w:tmpl w:val="6948645E"/>
@@ -914,7 +2222,567 @@
       </w:rPr>
     </w:lvl>
   </w:abstractNum>
-  <w:abstractNum w:abstractNumId="2" w15:restartNumberingAfterBreak="0">
+  <w:abstractNum w:abstractNumId="4" w15:restartNumberingAfterBreak="0">
+    <w:nsid w:val="1C157D69"/>
+    <w:multiLevelType w:val="multilevel"/>
+    <w:tmpl w:val="E0268C9E"/>
+    <w:lvl w:ilvl="0">
+      <w:start w:val="1"/>
+      <w:numFmt w:val="bullet"/>
+      <w:lvlText w:val=""/>
+      <w:lvlJc w:val="left"/>
+      <w:pPr>
+        <w:tabs>
+          <w:tab w:val="num" w:pos="720"/>
+        </w:tabs>
+        <w:ind w:left="720" w:hanging="360"/>
+      </w:pPr>
+      <w:rPr>
+        <w:rFonts w:ascii="Symbol" w:hAnsi="Symbol" w:hint="default"/>
+        <w:sz w:val="20"/>
+      </w:rPr>
+    </w:lvl>
+    <w:lvl w:ilvl="1">
+      <w:start w:val="1"/>
+      <w:numFmt w:val="bullet"/>
+      <w:lvlText w:val="o"/>
+      <w:lvlJc w:val="left"/>
+      <w:pPr>
+        <w:tabs>
+          <w:tab w:val="num" w:pos="1440"/>
+        </w:tabs>
+        <w:ind w:left="1440" w:hanging="360"/>
+      </w:pPr>
+      <w:rPr>
+        <w:rFonts w:ascii="Courier New" w:hAnsi="Courier New" w:hint="default"/>
+        <w:sz w:val="20"/>
+      </w:rPr>
+    </w:lvl>
+    <w:lvl w:ilvl="2" w:tentative="1">
+      <w:start w:val="1"/>
+      <w:numFmt w:val="bullet"/>
+      <w:lvlText w:val=""/>
+      <w:lvlJc w:val="left"/>
+      <w:pPr>
+        <w:tabs>
+          <w:tab w:val="num" w:pos="2160"/>
+        </w:tabs>
+        <w:ind w:left="2160" w:hanging="360"/>
+      </w:pPr>
+      <w:rPr>
+        <w:rFonts w:ascii="Wingdings" w:hAnsi="Wingdings" w:hint="default"/>
+        <w:sz w:val="20"/>
+      </w:rPr>
+    </w:lvl>
+    <w:lvl w:ilvl="3" w:tentative="1">
+      <w:start w:val="1"/>
+      <w:numFmt w:val="bullet"/>
+      <w:lvlText w:val=""/>
+      <w:lvlJc w:val="left"/>
+      <w:pPr>
+        <w:tabs>
+          <w:tab w:val="num" w:pos="2880"/>
+        </w:tabs>
+        <w:ind w:left="2880" w:hanging="360"/>
+      </w:pPr>
+      <w:rPr>
+        <w:rFonts w:ascii="Wingdings" w:hAnsi="Wingdings" w:hint="default"/>
+        <w:sz w:val="20"/>
+      </w:rPr>
+    </w:lvl>
+    <w:lvl w:ilvl="4" w:tentative="1">
+      <w:start w:val="1"/>
+      <w:numFmt w:val="bullet"/>
+      <w:lvlText w:val=""/>
+      <w:lvlJc w:val="left"/>
+      <w:pPr>
+        <w:tabs>
+          <w:tab w:val="num" w:pos="3600"/>
+        </w:tabs>
+        <w:ind w:left="3600" w:hanging="360"/>
+      </w:pPr>
+      <w:rPr>
+        <w:rFonts w:ascii="Wingdings" w:hAnsi="Wingdings" w:hint="default"/>
+        <w:sz w:val="20"/>
+      </w:rPr>
+    </w:lvl>
+    <w:lvl w:ilvl="5" w:tentative="1">
+      <w:start w:val="1"/>
+      <w:numFmt w:val="bullet"/>
+      <w:lvlText w:val=""/>
+      <w:lvlJc w:val="left"/>
+      <w:pPr>
+        <w:tabs>
+          <w:tab w:val="num" w:pos="4320"/>
+        </w:tabs>
+        <w:ind w:left="4320" w:hanging="360"/>
+      </w:pPr>
+      <w:rPr>
+        <w:rFonts w:ascii="Wingdings" w:hAnsi="Wingdings" w:hint="default"/>
+        <w:sz w:val="20"/>
+      </w:rPr>
+    </w:lvl>
+    <w:lvl w:ilvl="6" w:tentative="1">
+      <w:start w:val="1"/>
+      <w:numFmt w:val="bullet"/>
+      <w:lvlText w:val=""/>
+      <w:lvlJc w:val="left"/>
+      <w:pPr>
+        <w:tabs>
+          <w:tab w:val="num" w:pos="5040"/>
+        </w:tabs>
+        <w:ind w:left="5040" w:hanging="360"/>
+      </w:pPr>
+      <w:rPr>
+        <w:rFonts w:ascii="Wingdings" w:hAnsi="Wingdings" w:hint="default"/>
+        <w:sz w:val="20"/>
+      </w:rPr>
+    </w:lvl>
+    <w:lvl w:ilvl="7" w:tentative="1">
+      <w:start w:val="1"/>
+      <w:numFmt w:val="bullet"/>
+      <w:lvlText w:val=""/>
+      <w:lvlJc w:val="left"/>
+      <w:pPr>
+        <w:tabs>
+          <w:tab w:val="num" w:pos="5760"/>
+        </w:tabs>
+        <w:ind w:left="5760" w:hanging="360"/>
+      </w:pPr>
+      <w:rPr>
+        <w:rFonts w:ascii="Wingdings" w:hAnsi="Wingdings" w:hint="default"/>
+        <w:sz w:val="20"/>
+      </w:rPr>
+    </w:lvl>
+    <w:lvl w:ilvl="8" w:tentative="1">
+      <w:start w:val="1"/>
+      <w:numFmt w:val="bullet"/>
+      <w:lvlText w:val=""/>
+      <w:lvlJc w:val="left"/>
+      <w:pPr>
+        <w:tabs>
+          <w:tab w:val="num" w:pos="6480"/>
+        </w:tabs>
+        <w:ind w:left="6480" w:hanging="360"/>
+      </w:pPr>
+      <w:rPr>
+        <w:rFonts w:ascii="Wingdings" w:hAnsi="Wingdings" w:hint="default"/>
+        <w:sz w:val="20"/>
+      </w:rPr>
+    </w:lvl>
+  </w:abstractNum>
+  <w:abstractNum w:abstractNumId="5" w15:restartNumberingAfterBreak="0">
+    <w:nsid w:val="2B7F6A79"/>
+    <w:multiLevelType w:val="multilevel"/>
+    <w:tmpl w:val="BEF659B0"/>
+    <w:lvl w:ilvl="0">
+      <w:start w:val="1"/>
+      <w:numFmt w:val="bullet"/>
+      <w:lvlText w:val=""/>
+      <w:lvlJc w:val="left"/>
+      <w:pPr>
+        <w:tabs>
+          <w:tab w:val="num" w:pos="720"/>
+        </w:tabs>
+        <w:ind w:left="720" w:hanging="360"/>
+      </w:pPr>
+      <w:rPr>
+        <w:rFonts w:ascii="Symbol" w:hAnsi="Symbol" w:hint="default"/>
+        <w:sz w:val="20"/>
+      </w:rPr>
+    </w:lvl>
+    <w:lvl w:ilvl="1">
+      <w:start w:val="1"/>
+      <w:numFmt w:val="bullet"/>
+      <w:lvlText w:val="o"/>
+      <w:lvlJc w:val="left"/>
+      <w:pPr>
+        <w:tabs>
+          <w:tab w:val="num" w:pos="1440"/>
+        </w:tabs>
+        <w:ind w:left="1440" w:hanging="360"/>
+      </w:pPr>
+      <w:rPr>
+        <w:rFonts w:ascii="Courier New" w:hAnsi="Courier New" w:hint="default"/>
+        <w:sz w:val="20"/>
+      </w:rPr>
+    </w:lvl>
+    <w:lvl w:ilvl="2" w:tentative="1">
+      <w:start w:val="1"/>
+      <w:numFmt w:val="bullet"/>
+      <w:lvlText w:val=""/>
+      <w:lvlJc w:val="left"/>
+      <w:pPr>
+        <w:tabs>
+          <w:tab w:val="num" w:pos="2160"/>
+        </w:tabs>
+        <w:ind w:left="2160" w:hanging="360"/>
+      </w:pPr>
+      <w:rPr>
+        <w:rFonts w:ascii="Wingdings" w:hAnsi="Wingdings" w:hint="default"/>
+        <w:sz w:val="20"/>
+      </w:rPr>
+    </w:lvl>
+    <w:lvl w:ilvl="3" w:tentative="1">
+      <w:start w:val="1"/>
+      <w:numFmt w:val="bullet"/>
+      <w:lvlText w:val=""/>
+      <w:lvlJc w:val="left"/>
+      <w:pPr>
+        <w:tabs>
+          <w:tab w:val="num" w:pos="2880"/>
+        </w:tabs>
+        <w:ind w:left="2880" w:hanging="360"/>
+      </w:pPr>
+      <w:rPr>
+        <w:rFonts w:ascii="Wingdings" w:hAnsi="Wingdings" w:hint="default"/>
+        <w:sz w:val="20"/>
+      </w:rPr>
+    </w:lvl>
+    <w:lvl w:ilvl="4" w:tentative="1">
+      <w:start w:val="1"/>
+      <w:numFmt w:val="bullet"/>
+      <w:lvlText w:val=""/>
+      <w:lvlJc w:val="left"/>
+      <w:pPr>
+        <w:tabs>
+          <w:tab w:val="num" w:pos="3600"/>
+        </w:tabs>
+        <w:ind w:left="3600" w:hanging="360"/>
+      </w:pPr>
+      <w:rPr>
+        <w:rFonts w:ascii="Wingdings" w:hAnsi="Wingdings" w:hint="default"/>
+        <w:sz w:val="20"/>
+      </w:rPr>
+    </w:lvl>
+    <w:lvl w:ilvl="5" w:tentative="1">
+      <w:start w:val="1"/>
+      <w:numFmt w:val="bullet"/>
+      <w:lvlText w:val=""/>
+      <w:lvlJc w:val="left"/>
+      <w:pPr>
+        <w:tabs>
+          <w:tab w:val="num" w:pos="4320"/>
+        </w:tabs>
+        <w:ind w:left="4320" w:hanging="360"/>
+      </w:pPr>
+      <w:rPr>
+        <w:rFonts w:ascii="Wingdings" w:hAnsi="Wingdings" w:hint="default"/>
+        <w:sz w:val="20"/>
+      </w:rPr>
+    </w:lvl>
+    <w:lvl w:ilvl="6" w:tentative="1">
+      <w:start w:val="1"/>
+      <w:numFmt w:val="bullet"/>
+      <w:lvlText w:val=""/>
+      <w:lvlJc w:val="left"/>
+      <w:pPr>
+        <w:tabs>
+          <w:tab w:val="num" w:pos="5040"/>
+        </w:tabs>
+        <w:ind w:left="5040" w:hanging="360"/>
+      </w:pPr>
+      <w:rPr>
+        <w:rFonts w:ascii="Wingdings" w:hAnsi="Wingdings" w:hint="default"/>
+        <w:sz w:val="20"/>
+      </w:rPr>
+    </w:lvl>
+    <w:lvl w:ilvl="7" w:tentative="1">
+      <w:start w:val="1"/>
+      <w:numFmt w:val="bullet"/>
+      <w:lvlText w:val=""/>
+      <w:lvlJc w:val="left"/>
+      <w:pPr>
+        <w:tabs>
+          <w:tab w:val="num" w:pos="5760"/>
+        </w:tabs>
+        <w:ind w:left="5760" w:hanging="360"/>
+      </w:pPr>
+      <w:rPr>
+        <w:rFonts w:ascii="Wingdings" w:hAnsi="Wingdings" w:hint="default"/>
+        <w:sz w:val="20"/>
+      </w:rPr>
+    </w:lvl>
+    <w:lvl w:ilvl="8" w:tentative="1">
+      <w:start w:val="1"/>
+      <w:numFmt w:val="bullet"/>
+      <w:lvlText w:val=""/>
+      <w:lvlJc w:val="left"/>
+      <w:pPr>
+        <w:tabs>
+          <w:tab w:val="num" w:pos="6480"/>
+        </w:tabs>
+        <w:ind w:left="6480" w:hanging="360"/>
+      </w:pPr>
+      <w:rPr>
+        <w:rFonts w:ascii="Wingdings" w:hAnsi="Wingdings" w:hint="default"/>
+        <w:sz w:val="20"/>
+      </w:rPr>
+    </w:lvl>
+  </w:abstractNum>
+  <w:abstractNum w:abstractNumId="6" w15:restartNumberingAfterBreak="0">
+    <w:nsid w:val="34431E77"/>
+    <w:multiLevelType w:val="hybridMultilevel"/>
+    <w:tmpl w:val="049065CE"/>
+    <w:lvl w:ilvl="0" w:tplc="10000001">
+      <w:start w:val="1"/>
+      <w:numFmt w:val="bullet"/>
+      <w:lvlText w:val=""/>
+      <w:lvlJc w:val="left"/>
+      <w:pPr>
+        <w:ind w:left="720" w:hanging="360"/>
+      </w:pPr>
+      <w:rPr>
+        <w:rFonts w:ascii="Symbol" w:hAnsi="Symbol" w:hint="default"/>
+      </w:rPr>
+    </w:lvl>
+    <w:lvl w:ilvl="1" w:tplc="10000003" w:tentative="1">
+      <w:start w:val="1"/>
+      <w:numFmt w:val="bullet"/>
+      <w:lvlText w:val="o"/>
+      <w:lvlJc w:val="left"/>
+      <w:pPr>
+        <w:ind w:left="1440" w:hanging="360"/>
+      </w:pPr>
+      <w:rPr>
+        <w:rFonts w:ascii="Courier New" w:hAnsi="Courier New" w:cs="Courier New" w:hint="default"/>
+      </w:rPr>
+    </w:lvl>
+    <w:lvl w:ilvl="2" w:tplc="10000005" w:tentative="1">
+      <w:start w:val="1"/>
+      <w:numFmt w:val="bullet"/>
+      <w:lvlText w:val=""/>
+      <w:lvlJc w:val="left"/>
+      <w:pPr>
+        <w:ind w:left="2160" w:hanging="360"/>
+      </w:pPr>
+      <w:rPr>
+        <w:rFonts w:ascii="Wingdings" w:hAnsi="Wingdings" w:hint="default"/>
+      </w:rPr>
+    </w:lvl>
+    <w:lvl w:ilvl="3" w:tplc="10000001" w:tentative="1">
+      <w:start w:val="1"/>
+      <w:numFmt w:val="bullet"/>
+      <w:lvlText w:val=""/>
+      <w:lvlJc w:val="left"/>
+      <w:pPr>
+        <w:ind w:left="2880" w:hanging="360"/>
+      </w:pPr>
+      <w:rPr>
+        <w:rFonts w:ascii="Symbol" w:hAnsi="Symbol" w:hint="default"/>
+      </w:rPr>
+    </w:lvl>
+    <w:lvl w:ilvl="4" w:tplc="10000003" w:tentative="1">
+      <w:start w:val="1"/>
+      <w:numFmt w:val="bullet"/>
+      <w:lvlText w:val="o"/>
+      <w:lvlJc w:val="left"/>
+      <w:pPr>
+        <w:ind w:left="3600" w:hanging="360"/>
+      </w:pPr>
+      <w:rPr>
+        <w:rFonts w:ascii="Courier New" w:hAnsi="Courier New" w:cs="Courier New" w:hint="default"/>
+      </w:rPr>
+    </w:lvl>
+    <w:lvl w:ilvl="5" w:tplc="10000005" w:tentative="1">
+      <w:start w:val="1"/>
+      <w:numFmt w:val="bullet"/>
+      <w:lvlText w:val=""/>
+      <w:lvlJc w:val="left"/>
+      <w:pPr>
+        <w:ind w:left="4320" w:hanging="360"/>
+      </w:pPr>
+      <w:rPr>
+        <w:rFonts w:ascii="Wingdings" w:hAnsi="Wingdings" w:hint="default"/>
+      </w:rPr>
+    </w:lvl>
+    <w:lvl w:ilvl="6" w:tplc="10000001" w:tentative="1">
+      <w:start w:val="1"/>
+      <w:numFmt w:val="bullet"/>
+      <w:lvlText w:val=""/>
+      <w:lvlJc w:val="left"/>
+      <w:pPr>
+        <w:ind w:left="5040" w:hanging="360"/>
+      </w:pPr>
+      <w:rPr>
+        <w:rFonts w:ascii="Symbol" w:hAnsi="Symbol" w:hint="default"/>
+      </w:rPr>
+    </w:lvl>
+    <w:lvl w:ilvl="7" w:tplc="10000003" w:tentative="1">
+      <w:start w:val="1"/>
+      <w:numFmt w:val="bullet"/>
+      <w:lvlText w:val="o"/>
+      <w:lvlJc w:val="left"/>
+      <w:pPr>
+        <w:ind w:left="5760" w:hanging="360"/>
+      </w:pPr>
+      <w:rPr>
+        <w:rFonts w:ascii="Courier New" w:hAnsi="Courier New" w:cs="Courier New" w:hint="default"/>
+      </w:rPr>
+    </w:lvl>
+    <w:lvl w:ilvl="8" w:tplc="10000005" w:tentative="1">
+      <w:start w:val="1"/>
+      <w:numFmt w:val="bullet"/>
+      <w:lvlText w:val=""/>
+      <w:lvlJc w:val="left"/>
+      <w:pPr>
+        <w:ind w:left="6480" w:hanging="360"/>
+      </w:pPr>
+      <w:rPr>
+        <w:rFonts w:ascii="Wingdings" w:hAnsi="Wingdings" w:hint="default"/>
+      </w:rPr>
+    </w:lvl>
+  </w:abstractNum>
+  <w:abstractNum w:abstractNumId="7" w15:restartNumberingAfterBreak="0">
+    <w:nsid w:val="39233D65"/>
+    <w:multiLevelType w:val="multilevel"/>
+    <w:tmpl w:val="3D147330"/>
+    <w:lvl w:ilvl="0">
+      <w:start w:val="1"/>
+      <w:numFmt w:val="bullet"/>
+      <w:lvlText w:val=""/>
+      <w:lvlJc w:val="left"/>
+      <w:pPr>
+        <w:tabs>
+          <w:tab w:val="num" w:pos="720"/>
+        </w:tabs>
+        <w:ind w:left="720" w:hanging="360"/>
+      </w:pPr>
+      <w:rPr>
+        <w:rFonts w:ascii="Symbol" w:hAnsi="Symbol" w:hint="default"/>
+        <w:sz w:val="20"/>
+      </w:rPr>
+    </w:lvl>
+    <w:lvl w:ilvl="1" w:tentative="1">
+      <w:start w:val="1"/>
+      <w:numFmt w:val="bullet"/>
+      <w:lvlText w:val="o"/>
+      <w:lvlJc w:val="left"/>
+      <w:pPr>
+        <w:tabs>
+          <w:tab w:val="num" w:pos="1440"/>
+        </w:tabs>
+        <w:ind w:left="1440" w:hanging="360"/>
+      </w:pPr>
+      <w:rPr>
+        <w:rFonts w:ascii="Courier New" w:hAnsi="Courier New" w:hint="default"/>
+        <w:sz w:val="20"/>
+      </w:rPr>
+    </w:lvl>
+    <w:lvl w:ilvl="2" w:tentative="1">
+      <w:start w:val="1"/>
+      <w:numFmt w:val="bullet"/>
+      <w:lvlText w:val=""/>
+      <w:lvlJc w:val="left"/>
+      <w:pPr>
+        <w:tabs>
+          <w:tab w:val="num" w:pos="2160"/>
+        </w:tabs>
+        <w:ind w:left="2160" w:hanging="360"/>
+      </w:pPr>
+      <w:rPr>
+        <w:rFonts w:ascii="Wingdings" w:hAnsi="Wingdings" w:hint="default"/>
+        <w:sz w:val="20"/>
+      </w:rPr>
+    </w:lvl>
+    <w:lvl w:ilvl="3" w:tentative="1">
+      <w:start w:val="1"/>
+      <w:numFmt w:val="bullet"/>
+      <w:lvlText w:val=""/>
+      <w:lvlJc w:val="left"/>
+      <w:pPr>
+        <w:tabs>
+          <w:tab w:val="num" w:pos="2880"/>
+        </w:tabs>
+        <w:ind w:left="2880" w:hanging="360"/>
+      </w:pPr>
+      <w:rPr>
+        <w:rFonts w:ascii="Wingdings" w:hAnsi="Wingdings" w:hint="default"/>
+        <w:sz w:val="20"/>
+      </w:rPr>
+    </w:lvl>
+    <w:lvl w:ilvl="4" w:tentative="1">
+      <w:start w:val="1"/>
+      <w:numFmt w:val="bullet"/>
+      <w:lvlText w:val=""/>
+      <w:lvlJc w:val="left"/>
+      <w:pPr>
+        <w:tabs>
+          <w:tab w:val="num" w:pos="3600"/>
+        </w:tabs>
+        <w:ind w:left="3600" w:hanging="360"/>
+      </w:pPr>
+      <w:rPr>
+        <w:rFonts w:ascii="Wingdings" w:hAnsi="Wingdings" w:hint="default"/>
+        <w:sz w:val="20"/>
+      </w:rPr>
+    </w:lvl>
+    <w:lvl w:ilvl="5" w:tentative="1">
+      <w:start w:val="1"/>
+      <w:numFmt w:val="bullet"/>
+      <w:lvlText w:val=""/>
+      <w:lvlJc w:val="left"/>
+      <w:pPr>
+        <w:tabs>
+          <w:tab w:val="num" w:pos="4320"/>
+        </w:tabs>
+        <w:ind w:left="4320" w:hanging="360"/>
+      </w:pPr>
+      <w:rPr>
+        <w:rFonts w:ascii="Wingdings" w:hAnsi="Wingdings" w:hint="default"/>
+        <w:sz w:val="20"/>
+      </w:rPr>
+    </w:lvl>
+    <w:lvl w:ilvl="6" w:tentative="1">
+      <w:start w:val="1"/>
+      <w:numFmt w:val="bullet"/>
+      <w:lvlText w:val=""/>
+      <w:lvlJc w:val="left"/>
+      <w:pPr>
+        <w:tabs>
+          <w:tab w:val="num" w:pos="5040"/>
+        </w:tabs>
+        <w:ind w:left="5040" w:hanging="360"/>
+      </w:pPr>
+      <w:rPr>
+        <w:rFonts w:ascii="Wingdings" w:hAnsi="Wingdings" w:hint="default"/>
+        <w:sz w:val="20"/>
+      </w:rPr>
+    </w:lvl>
+    <w:lvl w:ilvl="7" w:tentative="1">
+      <w:start w:val="1"/>
+      <w:numFmt w:val="bullet"/>
+      <w:lvlText w:val=""/>
+      <w:lvlJc w:val="left"/>
+      <w:pPr>
+        <w:tabs>
+          <w:tab w:val="num" w:pos="5760"/>
+        </w:tabs>
+        <w:ind w:left="5760" w:hanging="360"/>
+      </w:pPr>
+      <w:rPr>
+        <w:rFonts w:ascii="Wingdings" w:hAnsi="Wingdings" w:hint="default"/>
+        <w:sz w:val="20"/>
+      </w:rPr>
+    </w:lvl>
+    <w:lvl w:ilvl="8" w:tentative="1">
+      <w:start w:val="1"/>
+      <w:numFmt w:val="bullet"/>
+      <w:lvlText w:val=""/>
+      <w:lvlJc w:val="left"/>
+      <w:pPr>
+        <w:tabs>
+          <w:tab w:val="num" w:pos="6480"/>
+        </w:tabs>
+        <w:ind w:left="6480" w:hanging="360"/>
+      </w:pPr>
+      <w:rPr>
+        <w:rFonts w:ascii="Wingdings" w:hAnsi="Wingdings" w:hint="default"/>
+        <w:sz w:val="20"/>
+      </w:rPr>
+    </w:lvl>
+  </w:abstractNum>
+  <w:abstractNum w:abstractNumId="8" w15:restartNumberingAfterBreak="0">
     <w:nsid w:val="39EC63BE"/>
     <w:multiLevelType w:val="multilevel"/>
     <w:tmpl w:val="95BE2226"/>
@@ -1063,7 +2931,7 @@
       </w:rPr>
     </w:lvl>
   </w:abstractNum>
-  <w:abstractNum w:abstractNumId="3" w15:restartNumberingAfterBreak="0">
+  <w:abstractNum w:abstractNumId="9" w15:restartNumberingAfterBreak="0">
     <w:nsid w:val="44E66DC2"/>
     <w:multiLevelType w:val="multilevel"/>
     <w:tmpl w:val="E2C64B50"/>
@@ -1212,7 +3080,7 @@
       </w:rPr>
     </w:lvl>
   </w:abstractNum>
-  <w:abstractNum w:abstractNumId="4" w15:restartNumberingAfterBreak="0">
+  <w:abstractNum w:abstractNumId="10" w15:restartNumberingAfterBreak="0">
     <w:nsid w:val="45AE6C79"/>
     <w:multiLevelType w:val="hybridMultilevel"/>
     <w:tmpl w:val="43EAE8F4"/>
@@ -1325,7 +3193,7 @@
       </w:rPr>
     </w:lvl>
   </w:abstractNum>
-  <w:abstractNum w:abstractNumId="5" w15:restartNumberingAfterBreak="0">
+  <w:abstractNum w:abstractNumId="11" w15:restartNumberingAfterBreak="0">
     <w:nsid w:val="4B3D3786"/>
     <w:multiLevelType w:val="hybridMultilevel"/>
     <w:tmpl w:val="98B27E44"/>
@@ -1438,7 +3306,7 @@
       </w:rPr>
     </w:lvl>
   </w:abstractNum>
-  <w:abstractNum w:abstractNumId="6" w15:restartNumberingAfterBreak="0">
+  <w:abstractNum w:abstractNumId="12" w15:restartNumberingAfterBreak="0">
     <w:nsid w:val="56AF3E96"/>
     <w:multiLevelType w:val="multilevel"/>
     <w:tmpl w:val="6C94F10A"/>
@@ -1551,7 +3419,7 @@
       </w:pPr>
     </w:lvl>
   </w:abstractNum>
-  <w:abstractNum w:abstractNumId="7" w15:restartNumberingAfterBreak="0">
+  <w:abstractNum w:abstractNumId="13" w15:restartNumberingAfterBreak="0">
     <w:nsid w:val="576C12C6"/>
     <w:multiLevelType w:val="hybridMultilevel"/>
     <w:tmpl w:val="0B2AC576"/>
@@ -1664,7 +3532,7 @@
       </w:rPr>
     </w:lvl>
   </w:abstractNum>
-  <w:abstractNum w:abstractNumId="8" w15:restartNumberingAfterBreak="0">
+  <w:abstractNum w:abstractNumId="14" w15:restartNumberingAfterBreak="0">
     <w:nsid w:val="5BBD3BD2"/>
     <w:multiLevelType w:val="multilevel"/>
     <w:tmpl w:val="32BE1DE2"/>
@@ -1813,7 +3681,7 @@
       </w:rPr>
     </w:lvl>
   </w:abstractNum>
-  <w:abstractNum w:abstractNumId="9" w15:restartNumberingAfterBreak="0">
+  <w:abstractNum w:abstractNumId="15" w15:restartNumberingAfterBreak="0">
     <w:nsid w:val="6A521238"/>
     <w:multiLevelType w:val="multilevel"/>
     <w:tmpl w:val="55CAA3A4"/>
@@ -1962,7 +3830,7 @@
       </w:rPr>
     </w:lvl>
   </w:abstractNum>
-  <w:abstractNum w:abstractNumId="10" w15:restartNumberingAfterBreak="0">
+  <w:abstractNum w:abstractNumId="16" w15:restartNumberingAfterBreak="0">
     <w:nsid w:val="7EEC7D9D"/>
     <w:multiLevelType w:val="hybridMultilevel"/>
     <w:tmpl w:val="65248030"/>
@@ -2076,37 +3944,55 @@
     </w:lvl>
   </w:abstractNum>
   <w:num w:numId="1">
-    <w:abstractNumId w:val="7"/>
+    <w:abstractNumId w:val="13"/>
   </w:num>
   <w:num w:numId="2">
     <w:abstractNumId w:val="0"/>
   </w:num>
   <w:num w:numId="3">
+    <w:abstractNumId w:val="3"/>
+  </w:num>
+  <w:num w:numId="4">
+    <w:abstractNumId w:val="11"/>
+  </w:num>
+  <w:num w:numId="5">
+    <w:abstractNumId w:val="10"/>
+  </w:num>
+  <w:num w:numId="6">
+    <w:abstractNumId w:val="16"/>
+  </w:num>
+  <w:num w:numId="7">
+    <w:abstractNumId w:val="12"/>
+  </w:num>
+  <w:num w:numId="8">
+    <w:abstractNumId w:val="14"/>
+  </w:num>
+  <w:num w:numId="9">
+    <w:abstractNumId w:val="15"/>
+  </w:num>
+  <w:num w:numId="10">
+    <w:abstractNumId w:val="8"/>
+  </w:num>
+  <w:num w:numId="11">
+    <w:abstractNumId w:val="9"/>
+  </w:num>
+  <w:num w:numId="12">
+    <w:abstractNumId w:val="6"/>
+  </w:num>
+  <w:num w:numId="13">
+    <w:abstractNumId w:val="7"/>
+  </w:num>
+  <w:num w:numId="14">
+    <w:abstractNumId w:val="5"/>
+  </w:num>
+  <w:num w:numId="15">
     <w:abstractNumId w:val="1"/>
   </w:num>
-  <w:num w:numId="4">
-    <w:abstractNumId w:val="5"/>
-  </w:num>
-  <w:num w:numId="5">
+  <w:num w:numId="16">
     <w:abstractNumId w:val="4"/>
   </w:num>
-  <w:num w:numId="6">
-    <w:abstractNumId w:val="10"/>
-  </w:num>
-  <w:num w:numId="7">
-    <w:abstractNumId w:val="6"/>
-  </w:num>
-  <w:num w:numId="8">
-    <w:abstractNumId w:val="8"/>
-  </w:num>
-  <w:num w:numId="9">
-    <w:abstractNumId w:val="9"/>
-  </w:num>
-  <w:num w:numId="10">
+  <w:num w:numId="17">
     <w:abstractNumId w:val="2"/>
-  </w:num>
-  <w:num w:numId="11">
-    <w:abstractNumId w:val="3"/>
   </w:num>
 </w:numbering>
 </file>
@@ -3134,7 +5020,6 @@
       <w:rFonts w:ascii="Times New Roman" w:eastAsia="Times New Roman" w:hAnsi="Times New Roman" w:cs="Times New Roman"/>
       <w:sz w:val="24"/>
       <w:szCs w:val="24"/>
-      <w:lang/>
     </w:rPr>
   </w:style>
 </w:styles>

</xml_diff>